<commit_message>
Research: content plans for HR Hiring Flow and Bill Creation
Co-Authored-By: Claude Opus 5.5 <noreply@anthropic.com>
Claude-Session: https://claude.ai/code/session_01AnNjVdUt7zLue4GreZ19rC
</commit_message>
<xml_diff>
--- a/TOC-output/HR Hiring Flow Automation with Claude/Research/HR Hiring Flow Automation with Claude - Research and Content Plan.docx
+++ b/TOC-output/HR Hiring Flow Automation with Claude/Research/HR Hiring Flow Automation with Claude - Research and Content Plan.docx
@@ -417,7 +417,7 @@
           </w:tcPr>
           <w:p>
             <w:r>
-              <w:t>See how consent, retention, minimisation and fairness are implemented and evidenced.</w:t>
+              <w:t>See how consent, retention, minimization and fairness are implemented and evidenced.</w:t>
             </w:r>
           </w:p>
         </w:tc>
@@ -503,7 +503,7 @@
         <w:pStyle w:val="ListBullet"/>
       </w:pPr>
       <w:r>
-        <w:t>Can you describe your organisation's hiring steps from requisition to offer, and which portal exports you can download?</w:t>
+        <w:t>Can you describe your organization's hiring steps from requisition to offer, and which portal exports you can download?</w:t>
       </w:r>
     </w:p>
     <w:p>
@@ -519,15 +519,15 @@
         <w:pStyle w:val="ListBullet"/>
       </w:pPr>
       <w:r>
-        <w:t>Can you obtain a Claude API key or Claude Code access through your organisation for the training days?</w:t>
-      </w:r>
-    </w:p>
-    <w:p>
-      <w:pPr>
-        <w:pStyle w:val="ListBullet"/>
-      </w:pPr>
-      <w:r>
-        <w:t>Has your organisation agreed that only synthetic candidate data will be used in the labs?</w:t>
+        <w:t>Can you obtain a Claude API key or Claude Code access through your organization for the training days?</w:t>
+      </w:r>
+    </w:p>
+    <w:p>
+      <w:pPr>
+        <w:pStyle w:val="ListBullet"/>
+      </w:pPr>
+      <w:r>
+        <w:t>Has your organization agreed that only synthetic candidate data will be used in the labs?</w:t>
       </w:r>
     </w:p>
     <w:p>
@@ -721,7 +721,7 @@
           </w:tcPr>
           <w:p>
             <w:r>
-              <w:t>Install using the official Claude Code documentation with an organisation account or API key.</w:t>
+              <w:t>Install using the official Claude Code documentation with an organization account or API key.</w:t>
             </w:r>
           </w:p>
         </w:tc>
@@ -1189,7 +1189,7 @@
           </w:tcPr>
           <w:p>
             <w:r>
-              <w:t>Organisation or personal GitHub account; the course template repository.</w:t>
+              <w:t>Organization or personal GitHub account; the course template repository.</w:t>
             </w:r>
           </w:p>
         </w:tc>
@@ -1827,7 +1827,7 @@
         <w:pStyle w:val="ListBullet"/>
       </w:pPr>
       <w:r>
-        <w:t>For EU candidates, GDPR Article 5 adds purpose limitation, data minimisation and storage limitation, and makes the controller able to demonstrate compliance [21].</w:t>
+        <w:t>For EU candidates, GDPR Article 5 adds purpose limitation, data minimization and storage limitation, and makes the controller able to demonstrate compliance [21].</w:t>
       </w:r>
     </w:p>
     <w:p>
@@ -1899,7 +1899,7 @@
         <w:pStyle w:val="ListNumber"/>
       </w:pPr>
       <w:r>
-        <w:t>Overlay the target flow and colour each node: model proposes, code executes, human approves.</w:t>
+        <w:t>Overlay the target flow and color each node: model proposes, code executes, human approves.</w:t>
       </w:r>
     </w:p>
     <w:p>
@@ -1974,7 +1974,7 @@
         <w:pStyle w:val="ListNumber"/>
       </w:pPr>
       <w:r>
-        <w:t>Draw the target flow in docs/flow_target.md and colour each node by who acts.</w:t>
+        <w:t>Draw the target flow in docs/flow_target.md and color each node by who acts.</w:t>
       </w:r>
     </w:p>
     <w:p>
@@ -2153,7 +2153,7 @@
         <w:pStyle w:val="ListBullet"/>
       </w:pPr>
       <w:r>
-        <w:t>Mermaid templates for current and target flows with a colour legend.</w:t>
+        <w:t>Mermaid templates for current and target flows with a color legend.</w:t>
       </w:r>
     </w:p>
     <w:p>
@@ -2915,7 +2915,7 @@
         <w:pStyle w:val="ListBullet"/>
       </w:pPr>
       <w:r>
-        <w:t>Learners can deduplicate across portals by normalised email and phone and report every rejected row.</w:t>
+        <w:t>Learners can deduplicate across portals by normalized email and phone and report every rejected row.</w:t>
       </w:r>
     </w:p>
     <w:p>
@@ -3043,7 +3043,7 @@
         <w:pStyle w:val="ListBullet"/>
       </w:pPr>
       <w:r>
-        <w:t>Normalise phone numbers to E.164 and emails to lower case before matching.</w:t>
+        <w:t>Normalize phone numbers to E.164 and emails to lower case before matching.</w:t>
       </w:r>
     </w:p>
     <w:p>
@@ -3198,7 +3198,7 @@
         <w:pStyle w:val="ListNumber"/>
       </w:pPr>
       <w:r>
-        <w:t>Normalise phones and emails and implement exact-match deduplication with merge provenance.</w:t>
+        <w:t>Normalize phones and emails and implement exact-match deduplication with merge provenance.</w:t>
       </w:r>
     </w:p>
     <w:p>
@@ -5879,7 +5879,7 @@
         <w:t xml:space="preserve">Goal. </w:t>
       </w:r>
       <w:r>
-        <w:t>Learners harden the pipeline with PII minimisation, consent and retention tracking, injection tests, named approval gates, bias monitoring and an append-only audit log.</w:t>
+        <w:t>Learners harden the pipeline with PII minimization, consent and retention tracking, injection tests, named approval gates, bias monitoring and an append-only audit log.</w:t>
       </w:r>
     </w:p>
     <w:p>
@@ -5967,15 +5967,15 @@
         <w:pStyle w:val="Heading4"/>
       </w:pPr>
       <w:r>
-        <w:t>PII minimisation, consent and retention</w:t>
-      </w:r>
-    </w:p>
-    <w:p>
-      <w:pPr>
-        <w:pStyle w:val="ListBullet"/>
-      </w:pPr>
-      <w:r>
-        <w:t>Data minimisation and storage limitation are GDPR principles, and the controller must be able to demonstrate compliance [21].</w:t>
+        <w:t>PII minimization, consent and retention</w:t>
+      </w:r>
+    </w:p>
+    <w:p>
+      <w:pPr>
+        <w:pStyle w:val="ListBullet"/>
+      </w:pPr>
+      <w:r>
+        <w:t>Data minimization and storage limitation are GDPR principles, and the controller must be able to demonstrate compliance [21].</w:t>
       </w:r>
     </w:p>
     <w:p>
@@ -6413,7 +6413,7 @@
         <w:pStyle w:val="ListNumber"/>
       </w:pPr>
       <w:r>
-        <w:t>Which GDPR principles drive what the model sees? Answer: Data minimisation and purpose limitation [21].</w:t>
+        <w:t>Which GDPR principles drive what the model sees? Answer: Data minimization and purpose limitation [21].</w:t>
       </w:r>
     </w:p>
     <w:p>
@@ -8352,7 +8352,7 @@
           </w:tcPr>
           <w:p>
             <w:r>
-              <w:t>PII minimisation, consent and retention tracking</w:t>
+              <w:t>PII minimization, consent and retention tracking</w:t>
             </w:r>
           </w:p>
         </w:tc>

</xml_diff>